<commit_message>
Word files styled to journal conventions: black text, justified manuscript body, APA hanging references, line numbers, proportional table columns, subscripted hypotheses, split multi-line equations, OOXML schema-valid output
Co-Authored-By: Claude Opus 5.5 <noreply@anthropic.com>
Claude-Session: https://claude.ai/code/session_01H9iHZGmP6JhCq5jxPGTAWf
</commit_message>
<xml_diff>
--- a/submission/01_Title_Page.docx
+++ b/submission/01_Title_Page.docx
@@ -6,6 +6,7 @@
     <w:p>
       <w:pPr>
         <w:pStyle w:val="Heading1"/>
+        <w:jc w:val="left"/>
       </w:pPr>
       <w:r>
         <w:t xml:space="preserve">Who gains from a market upgrade? Stock liquidity and prices around Vietnam’s FTSE Russell reclassification</w:t>
@@ -14,6 +15,7 @@
     <w:p>
       <w:pPr>
         <w:pStyle w:val="FirstParagraph"/>
+        <w:jc w:val="left"/>
       </w:pPr>
       <w:r>
         <w:t xml:space="preserve">Nguyen Thanh Binh</w:t>
@@ -55,6 +57,7 @@
     <w:p>
       <w:pPr>
         <w:pStyle w:val="BodyText"/>
+        <w:jc w:val="left"/>
       </w:pPr>
       <w:r>
         <w:rPr>
@@ -72,6 +75,7 @@
     <w:p>
       <w:pPr>
         <w:pStyle w:val="BodyText"/>
+        <w:jc w:val="left"/>
       </w:pPr>
       <w:r>
         <w:rPr>
@@ -89,6 +93,7 @@
     <w:p>
       <w:pPr>
         <w:pStyle w:val="BodyText"/>
+        <w:jc w:val="left"/>
       </w:pPr>
       <w:r>
         <w:t xml:space="preserve">* Corresponding author: Nguyen Van Trung, Academy of Policy and Development, Nam An Khanh Urban Area, Hoai Duc District, Hanoi, Vietnam. Email: 15233582@st.neu.edu.vn. Tel: +84 355 347 831.</w:t>
@@ -98,6 +103,7 @@
     <w:p>
       <w:pPr>
         <w:pStyle w:val="Heading2"/>
+        <w:jc w:val="left"/>
       </w:pPr>
       <w:r>
         <w:t xml:space="preserve">Author details</w:t>
@@ -106,6 +112,7 @@
     <w:p>
       <w:pPr>
         <w:pStyle w:val="FirstParagraph"/>
+        <w:jc w:val="left"/>
       </w:pPr>
       <w:r>
         <w:t xml:space="preserve">Nguyen Thanh Binh: nguyenthanhbinhapd@apd.edu.vn; ORCID 0009-0007-0042-2835</w:t>
@@ -114,6 +121,7 @@
     <w:p>
       <w:pPr>
         <w:pStyle w:val="BodyText"/>
+        <w:jc w:val="left"/>
       </w:pPr>
       <w:r>
         <w:t xml:space="preserve">Nguyen Van Trung: 15233582@st.neu.edu.vn; ORCID 0009-0008-3307-6569</w:t>
@@ -122,6 +130,7 @@
     <w:p>
       <w:pPr>
         <w:pStyle w:val="BodyText"/>
+        <w:jc w:val="left"/>
       </w:pPr>
       <w:r>
         <w:t xml:space="preserve">Nguyen Bach Diep: diepnb@apd.edu.vn; ORCID 0009-0003-0967-7528</w:t>
@@ -130,6 +139,7 @@
     <w:p>
       <w:pPr>
         <w:pStyle w:val="BodyText"/>
+        <w:jc w:val="left"/>
       </w:pPr>
       <w:r>
         <w:t xml:space="preserve">Ha Hong Hanh: hanhhh@neu.edu.vn; ORCID 0000-0003-3581-6571</w:t>
@@ -140,6 +150,7 @@
     <w:p>
       <w:pPr>
         <w:pStyle w:val="Heading2"/>
+        <w:jc w:val="left"/>
       </w:pPr>
       <w:r>
         <w:t xml:space="preserve">Acknowledgements</w:t>
@@ -148,6 +159,7 @@
     <w:p>
       <w:pPr>
         <w:pStyle w:val="FirstParagraph"/>
+        <w:jc w:val="left"/>
       </w:pPr>
       <w:r>
         <w:t xml:space="preserve">None.</w:t>
@@ -158,6 +170,7 @@
     <w:p>
       <w:pPr>
         <w:pStyle w:val="Heading2"/>
+        <w:jc w:val="left"/>
       </w:pPr>
       <w:r>
         <w:t xml:space="preserve">Declaration of competing interest</w:t>
@@ -166,6 +179,7 @@
     <w:p>
       <w:pPr>
         <w:pStyle w:val="FirstParagraph"/>
+        <w:jc w:val="left"/>
       </w:pPr>
       <w:r>
         <w:t xml:space="preserve">The authors declare that they have no known competing financial interests or personal relationships that could have appeared to influence the work reported in this paper.</w:t>
@@ -176,6 +190,7 @@
     <w:p>
       <w:pPr>
         <w:pStyle w:val="Heading2"/>
+        <w:jc w:val="left"/>
       </w:pPr>
       <w:r>
         <w:t xml:space="preserve">Funding</w:t>
@@ -184,6 +199,7 @@
     <w:p>
       <w:pPr>
         <w:pStyle w:val="FirstParagraph"/>
+        <w:jc w:val="left"/>
       </w:pPr>
       <w:r>
         <w:t xml:space="preserve">This research did not receive any specific grant from funding agencies in the public, commercial, or not-for-profit sectors.</w:t>
@@ -194,6 +210,7 @@
     <w:p>
       <w:pPr>
         <w:pStyle w:val="Heading2"/>
+        <w:jc w:val="left"/>
       </w:pPr>
       <w:r>
         <w:t xml:space="preserve">CRediT authorship contribution statement</w:t>
@@ -202,6 +219,7 @@
     <w:p>
       <w:pPr>
         <w:pStyle w:val="FirstParagraph"/>
+        <w:jc w:val="left"/>
       </w:pPr>
       <w:r>
         <w:t xml:space="preserve">Nguyen Thanh Binh: Conceptualization, Supervision, Validation, Writing – review &amp; editing. Nguyen Van Trung: Conceptualization, Data curation, Formal analysis, Investigation, Methodology, Software, Visualization, Writing – original draft, Writing – review &amp; editing. Nguyen Bach Diep: Methodology, Formal analysis, Writing – original draft. Ha Hong Hanh: Validation, Writing – review &amp; editing.</w:t>
@@ -212,6 +230,7 @@
     <w:p>
       <w:pPr>
         <w:pStyle w:val="Heading2"/>
+        <w:jc w:val="left"/>
       </w:pPr>
       <w:r>
         <w:t xml:space="preserve">Data availability</w:t>
@@ -220,6 +239,7 @@
     <w:p>
       <w:pPr>
         <w:pStyle w:val="FirstParagraph"/>
+        <w:jc w:val="left"/>
       </w:pPr>
       <w:r>
         <w:t xml:space="preserve">Daily price and volume data are public and were retrieved through the vnstock library (VCI source). The downloaded daily files, the R code that reproduces every table and figure, and the reproduction log are provided as supplementary material (Supplementary_Replication_Package.zip) and will be deposited in a public repository on acceptance.</w:t>
@@ -229,7 +249,7 @@
     <w:bookmarkEnd w:id="26"/>
     <w:sectPr>
       <w:headerReference r:id="rId9" w:type="default"/>
-      <w:pgMar w:bottom="1440" w:left="1440" w:right="1440" w:top="1440"/>
+      <w:pgMar w:bottom="1440" w:left="1440" w:right="1440" w:top="1440" w:header="708" w:footer="708" w:gutter="0"/>
     </w:sectPr>
   </w:body>
 </w:document>
@@ -277,7 +297,7 @@
 <file path=word/numbering.xml><?xml version="1.0" encoding="utf-8"?>
 <w:numbering xmlns:w="http://schemas.openxmlformats.org/wordprocessingml/2006/main">
   <w:abstractNum w:abstractNumId="990">
-    <w:nsid w:val="A990"/>
+    <w:nsid w:val="0000A990"/>
     <w:multiLevelType w:val="multilevel"/>
     <w:lvl w:ilvl="0">
       <w:numFmt w:val="bullet"/>
@@ -381,9 +401,11 @@
     <w:qFormat/>
     <w:pPr>
       <w:spacing w:after="0" w:line="480" w:lineRule="auto"/>
-    </w:pPr>
-    <w:rPr>
-      <w:rFonts w:ascii="Times New Roman" w:cs="Times New Roman" w:eastAsia="Times New Roman" w:hAnsi="Times New Roman"/>
+      <w:jc w:val="both"/>
+    </w:pPr>
+    <w:rPr>
+      <w:rFonts w:ascii="Times New Roman" w:cs="Times New Roman" w:eastAsia="Times New Roman" w:hAnsi="Times New Roman"/>
+      <w:color w:val="000000"/>
       <w:sz w:val="24"/>
     </w:rPr>
   </w:style>
@@ -391,12 +413,14 @@
     <w:name w:val="Body Text"/>
     <w:basedOn w:val="Normal"/>
     <w:link w:val="BodyTextChar"/>
+    <w:qFormat/>
     <w:pPr>
       <w:spacing w:after="0" w:before="180" w:line="480" w:lineRule="auto"/>
-    </w:pPr>
-    <w:qFormat/>
-    <w:rPr>
-      <w:rFonts w:ascii="Times New Roman" w:cs="Times New Roman" w:eastAsia="Times New Roman" w:hAnsi="Times New Roman"/>
+      <w:jc w:val="both"/>
+    </w:pPr>
+    <w:rPr>
+      <w:rFonts w:ascii="Times New Roman" w:cs="Times New Roman" w:eastAsia="Times New Roman" w:hAnsi="Times New Roman"/>
+      <w:color w:val="000000"/>
       <w:sz w:val="24"/>
     </w:rPr>
   </w:style>
@@ -407,9 +431,11 @@
     <w:qFormat/>
     <w:pPr>
       <w:spacing w:after="0" w:line="480" w:lineRule="auto"/>
-    </w:pPr>
-    <w:rPr>
-      <w:rFonts w:ascii="Times New Roman" w:cs="Times New Roman" w:eastAsia="Times New Roman" w:hAnsi="Times New Roman"/>
+      <w:jc w:val="both"/>
+    </w:pPr>
+    <w:rPr>
+      <w:rFonts w:ascii="Times New Roman" w:cs="Times New Roman" w:eastAsia="Times New Roman" w:hAnsi="Times New Roman"/>
+      <w:color w:val="000000"/>
       <w:sz w:val="24"/>
     </w:rPr>
   </w:style>
@@ -418,10 +444,11 @@
     <w:basedOn w:val="BodyText"/>
     <w:qFormat/>
     <w:pPr>
-      <w:spacing w:after="36" w:before="36"/>
-    </w:pPr>
-    <w:rPr>
-      <w:rFonts w:ascii="Times New Roman" w:cs="Times New Roman" w:eastAsia="Times New Roman" w:hAnsi="Times New Roman"/>
+      <w:spacing w:after="20" w:before="20" w:line="240" w:lineRule="auto"/>
+    </w:pPr>
+    <w:rPr>
+      <w:rFonts w:ascii="Times New Roman" w:cs="Times New Roman" w:eastAsia="Times New Roman" w:hAnsi="Times New Roman"/>
+      <w:color w:val="000000"/>
       <w:sz w:val="20"/>
     </w:rPr>
   </w:style>
@@ -440,6 +467,7 @@
       <w:rFonts w:ascii="Times New Roman" w:cs="Times New Roman" w:eastAsia="Times New Roman" w:hAnsi="Times New Roman"/>
       <w:b/>
       <w:bCs/>
+      <w:color w:val="000000"/>
       <w:sz w:val="32"/>
       <w:szCs w:val="36"/>
     </w:rPr>
@@ -457,6 +485,7 @@
     </w:pPr>
     <w:rPr>
       <w:rFonts w:ascii="Times New Roman" w:cs="Times New Roman" w:eastAsia="Times New Roman" w:hAnsi="Times New Roman"/>
+      <w:color w:val="000000"/>
       <w:sz w:val="30"/>
       <w:szCs w:val="30"/>
     </w:rPr>
@@ -472,6 +501,7 @@
     </w:pPr>
     <w:rPr>
       <w:rFonts w:ascii="Times New Roman" w:cs="Times New Roman" w:eastAsia="Times New Roman" w:hAnsi="Times New Roman"/>
+      <w:color w:val="000000"/>
     </w:rPr>
   </w:style>
   <w:style w:styleId="Date" w:type="paragraph">
@@ -485,6 +515,7 @@
     </w:pPr>
     <w:rPr>
       <w:rFonts w:ascii="Times New Roman" w:cs="Times New Roman" w:eastAsia="Times New Roman" w:hAnsi="Times New Roman"/>
+      <w:color w:val="000000"/>
     </w:rPr>
   </w:style>
   <w:style w:customStyle="1" w:styleId="AbstractTitle" w:type="paragraph">
@@ -495,16 +526,15 @@
     <w:pPr>
       <w:keepNext/>
       <w:keepLines/>
+      <w:spacing w:after="0" w:before="300"/>
       <w:jc w:val="center"/>
-      <w:spacing w:after="0" w:before="300"/>
-    </w:pPr>
-    <w:rPr>
+    </w:pPr>
+    <w:rPr>
+      <w:rFonts w:ascii="Times New Roman" w:cs="Times New Roman" w:eastAsia="Times New Roman" w:hAnsi="Times New Roman"/>
+      <w:b/>
+      <w:color w:val="000000"/>
       <w:sz w:val="20"/>
       <w:szCs w:val="20"/>
-      <w:rFonts w:ascii="Times New Roman" w:cs="Times New Roman" w:eastAsia="Times New Roman" w:hAnsi="Times New Roman"/>
-      <w:b/>
-      <w:color w:val="345A8A"/>
-      &gt;
     </w:rPr>
   </w:style>
   <w:style w:customStyle="1" w:styleId="Abstract" w:type="paragraph">
@@ -519,6 +549,7 @@
     </w:pPr>
     <w:rPr>
       <w:rFonts w:ascii="Times New Roman" w:cs="Times New Roman" w:eastAsia="Times New Roman" w:hAnsi="Times New Roman"/>
+      <w:color w:val="000000"/>
       <w:sz w:val="20"/>
       <w:szCs w:val="20"/>
     </w:rPr>
@@ -531,6 +562,7 @@
     <w:pPr/>
     <w:rPr>
       <w:rFonts w:ascii="Times New Roman" w:cs="Times New Roman" w:eastAsia="Times New Roman" w:hAnsi="Times New Roman"/>
+      <w:color w:val="000000"/>
     </w:rPr>
   </w:style>
   <w:style w:styleId="Heading1" w:type="paragraph">
@@ -549,7 +581,7 @@
       <w:rFonts w:ascii="Times New Roman" w:cs="Times New Roman" w:eastAsia="Times New Roman" w:hAnsi="Times New Roman"/>
       <w:b/>
       <w:bCs/>
-      <w:color w:themeColor="accent1" w:val="4F81BD"/>
+      <w:color w:val="000000"/>
       <w:sz w:val="32"/>
       <w:szCs w:val="32"/>
     </w:rPr>
@@ -571,7 +603,7 @@
       <w:rFonts w:ascii="Times New Roman" w:cs="Times New Roman" w:eastAsia="Times New Roman" w:hAnsi="Times New Roman"/>
       <w:b/>
       <w:bCs/>
-      <w:color w:themeColor="accent1" w:val="4F81BD"/>
+      <w:color w:val="000000"/>
       <w:sz w:val="28"/>
       <w:szCs w:val="28"/>
     </w:rPr>
@@ -593,7 +625,7 @@
       <w:rFonts w:ascii="Times New Roman" w:cs="Times New Roman" w:eastAsia="Times New Roman" w:hAnsi="Times New Roman"/>
       <w:b/>
       <w:bCs/>
-      <w:color w:themeColor="accent1" w:val="4F81BD"/>
+      <w:color w:val="000000"/>
       <w:sz w:val="24"/>
       <w:szCs w:val="24"/>
     </w:rPr>
@@ -613,9 +645,9 @@
     </w:pPr>
     <w:rPr>
       <w:rFonts w:ascii="Times New Roman" w:cs="Times New Roman" w:eastAsia="Times New Roman" w:hAnsi="Times New Roman"/>
+      <w:bCs/>
       <w:i/>
-      <w:bCs/>
-      <w:color w:themeColor="accent1" w:val="4F81BD"/>
+      <w:color w:val="000000"/>
       <w:sz w:val="24"/>
       <w:szCs w:val="24"/>
     </w:rPr>
@@ -636,7 +668,7 @@
     <w:rPr>
       <w:rFonts w:ascii="Times New Roman" w:cs="Times New Roman" w:eastAsia="Times New Roman" w:hAnsi="Times New Roman"/>
       <w:iCs/>
-      <w:color w:themeColor="accent1" w:val="4F81BD"/>
+      <w:color w:val="000000"/>
       <w:sz w:val="24"/>
       <w:szCs w:val="24"/>
     </w:rPr>
@@ -656,7 +688,7 @@
     </w:pPr>
     <w:rPr>
       <w:rFonts w:ascii="Times New Roman" w:cs="Times New Roman" w:eastAsia="Times New Roman" w:hAnsi="Times New Roman"/>
-      <w:color w:themeColor="accent1" w:val="4F81BD"/>
+      <w:color w:val="000000"/>
       <w:sz w:val="24"/>
       <w:szCs w:val="24"/>
     </w:rPr>
@@ -676,7 +708,7 @@
     </w:pPr>
     <w:rPr>
       <w:rFonts w:ascii="Times New Roman" w:cs="Times New Roman" w:eastAsia="Times New Roman" w:hAnsi="Times New Roman"/>
-      <w:color w:themeColor="accent1" w:val="4F81BD"/>
+      <w:color w:val="000000"/>
       <w:sz w:val="24"/>
       <w:szCs w:val="24"/>
     </w:rPr>
@@ -696,7 +728,7 @@
     </w:pPr>
     <w:rPr>
       <w:rFonts w:ascii="Times New Roman" w:cs="Times New Roman" w:eastAsia="Times New Roman" w:hAnsi="Times New Roman"/>
-      <w:color w:themeColor="accent1" w:val="4F81BD"/>
+      <w:color w:val="000000"/>
       <w:sz w:val="24"/>
       <w:szCs w:val="24"/>
     </w:rPr>
@@ -716,7 +748,7 @@
     </w:pPr>
     <w:rPr>
       <w:rFonts w:ascii="Times New Roman" w:cs="Times New Roman" w:eastAsia="Times New Roman" w:hAnsi="Times New Roman"/>
-      <w:color w:themeColor="accent1" w:val="4F81BD"/>
+      <w:color w:val="000000"/>
       <w:sz w:val="24"/>
       <w:szCs w:val="24"/>
     </w:rPr>
@@ -734,6 +766,7 @@
     </w:pPr>
     <w:rPr>
       <w:rFonts w:ascii="Times New Roman" w:cs="Times New Roman" w:eastAsia="Times New Roman" w:hAnsi="Times New Roman"/>
+      <w:color w:val="000000"/>
     </w:rPr>
   </w:style>
   <w:style w:styleId="FootnoteText" w:type="paragraph">
@@ -745,6 +778,7 @@
     <w:qFormat/>
     <w:rPr>
       <w:rFonts w:ascii="Times New Roman" w:cs="Times New Roman" w:eastAsia="Times New Roman" w:hAnsi="Times New Roman"/>
+      <w:color w:val="000000"/>
     </w:rPr>
   </w:style>
   <w:style w:default="1" w:styleId="DefaultParagraphFont" w:type="character">
@@ -753,6 +787,7 @@
     <w:unhideWhenUsed/>
     <w:rPr>
       <w:rFonts w:ascii="Times New Roman" w:cs="Times New Roman" w:eastAsia="Times New Roman" w:hAnsi="Times New Roman"/>
+      <w:color w:val="000000"/>
     </w:rPr>
   </w:style>
   <w:style w:default="1" w:styleId="Table" w:type="table">
@@ -761,8 +796,12 @@
     <w:semiHidden/>
     <w:unhideWhenUsed/>
     <w:qFormat/>
-    <w:rPr>
-      <w:rFonts w:ascii="Times New Roman" w:cs="Times New Roman" w:eastAsia="Times New Roman" w:hAnsi="Times New Roman"/>
+    <w:pPr>
+      <w:spacing w:after="20" w:before="20" w:line="240" w:lineRule="auto"/>
+    </w:pPr>
+    <w:rPr>
+      <w:rFonts w:ascii="Times New Roman" w:cs="Times New Roman" w:eastAsia="Times New Roman" w:hAnsi="Times New Roman"/>
+      <w:color w:val="000000"/>
       <w:sz w:val="20"/>
     </w:rPr>
     <w:tblPr>
@@ -783,10 +822,10 @@
         <w:jc w:val="left"/>
       </w:trPr>
       <w:tcPr>
-        <w:vAlign w:val="bottom"/>
         <w:tcBorders>
           <w:bottom w:val="single"/>
         </w:tcBorders>
+        <w:vAlign w:val="bottom"/>
       </w:tcPr>
     </w:tblStylePr>
   </w:style>
@@ -802,6 +841,7 @@
     <w:rPr>
       <w:rFonts w:ascii="Times New Roman" w:cs="Times New Roman" w:eastAsia="Times New Roman" w:hAnsi="Times New Roman"/>
       <w:b/>
+      <w:color w:val="000000"/>
     </w:rPr>
   </w:style>
   <w:style w:customStyle="1" w:styleId="Definition" w:type="paragraph">
@@ -809,6 +849,7 @@
     <w:basedOn w:val="Normal"/>
     <w:rPr>
       <w:rFonts w:ascii="Times New Roman" w:cs="Times New Roman" w:eastAsia="Times New Roman" w:hAnsi="Times New Roman"/>
+      <w:color w:val="000000"/>
     </w:rPr>
   </w:style>
   <w:style w:styleId="Caption" w:type="paragraph">
@@ -821,6 +862,7 @@
     <w:rPr>
       <w:rFonts w:ascii="Times New Roman" w:cs="Times New Roman" w:eastAsia="Times New Roman" w:hAnsi="Times New Roman"/>
       <w:i/>
+      <w:color w:val="000000"/>
     </w:rPr>
   </w:style>
   <w:style w:customStyle="1" w:styleId="TableCaption" w:type="paragraph">
@@ -831,6 +873,7 @@
     </w:pPr>
     <w:rPr>
       <w:rFonts w:ascii="Times New Roman" w:cs="Times New Roman" w:eastAsia="Times New Roman" w:hAnsi="Times New Roman"/>
+      <w:color w:val="000000"/>
     </w:rPr>
   </w:style>
   <w:style w:customStyle="1" w:styleId="ImageCaption" w:type="paragraph">
@@ -838,6 +881,7 @@
     <w:basedOn w:val="Caption"/>
     <w:rPr>
       <w:rFonts w:ascii="Times New Roman" w:cs="Times New Roman" w:eastAsia="Times New Roman" w:hAnsi="Times New Roman"/>
+      <w:color w:val="000000"/>
       <w:sz w:val="22"/>
     </w:rPr>
   </w:style>
@@ -846,6 +890,7 @@
     <w:basedOn w:val="Normal"/>
     <w:rPr>
       <w:rFonts w:ascii="Times New Roman" w:cs="Times New Roman" w:eastAsia="Times New Roman" w:hAnsi="Times New Roman"/>
+      <w:color w:val="000000"/>
     </w:rPr>
   </w:style>
   <w:style w:customStyle="1" w:styleId="CaptionedFigure" w:type="paragraph">
@@ -856,6 +901,7 @@
     </w:pPr>
     <w:rPr>
       <w:rFonts w:ascii="Times New Roman" w:cs="Times New Roman" w:eastAsia="Times New Roman" w:hAnsi="Times New Roman"/>
+      <w:color w:val="000000"/>
     </w:rPr>
   </w:style>
   <w:style w:customStyle="1" w:styleId="BodyTextChar" w:type="character">
@@ -864,6 +910,7 @@
     <w:link w:val="BodyText"/>
     <w:rPr>
       <w:rFonts w:ascii="Times New Roman" w:cs="Times New Roman" w:eastAsia="Times New Roman" w:hAnsi="Times New Roman"/>
+      <w:color w:val="000000"/>
     </w:rPr>
   </w:style>
   <w:style w:customStyle="1" w:styleId="VerbatimChar" w:type="character">
@@ -871,6 +918,7 @@
     <w:basedOn w:val="BodyTextChar"/>
     <w:rPr>
       <w:rFonts w:ascii="Times New Roman" w:cs="Times New Roman" w:eastAsia="Times New Roman" w:hAnsi="Times New Roman"/>
+      <w:color w:val="000000"/>
       <w:sz w:val="22"/>
     </w:rPr>
   </w:style>
@@ -879,6 +927,7 @@
     <w:basedOn w:val="BodyTextChar"/>
     <w:rPr>
       <w:rFonts w:ascii="Times New Roman" w:cs="Times New Roman" w:eastAsia="Times New Roman" w:hAnsi="Times New Roman"/>
+      <w:color w:val="000000"/>
     </w:rPr>
   </w:style>
   <w:style w:styleId="FootnoteReference" w:type="character">
@@ -886,6 +935,7 @@
     <w:basedOn w:val="BodyTextChar"/>
     <w:rPr>
       <w:rFonts w:ascii="Times New Roman" w:cs="Times New Roman" w:eastAsia="Times New Roman" w:hAnsi="Times New Roman"/>
+      <w:color w:val="000000"/>
       <w:vertAlign w:val="superscript"/>
     </w:rPr>
   </w:style>
@@ -894,7 +944,8 @@
     <w:basedOn w:val="BodyTextChar"/>
     <w:rPr>
       <w:rFonts w:ascii="Times New Roman" w:cs="Times New Roman" w:eastAsia="Times New Roman" w:hAnsi="Times New Roman"/>
-      <w:color w:themeColor="accent1" w:val="4F81BD"/>
+      <w:color w:val="000000"/>
+      <w:u w:val="none"/>
     </w:rPr>
   </w:style>
   <w:style w:styleId="TOCHeading" w:type="paragraph">
@@ -912,7 +963,7 @@
       <w:rFonts w:ascii="Times New Roman" w:cs="Times New Roman" w:eastAsia="Times New Roman" w:hAnsi="Times New Roman"/>
       <w:b w:val="0"/>
       <w:bCs w:val="0"/>
-      <w:color w:themeColor="accent1" w:themeShade="BF" w:val="365F91"/>
+      <w:color w:val="000000"/>
     </w:rPr>
   </w:style>
   <w:style w:type="paragraph" w:customStyle="1" w:styleId="SourceCode">
@@ -927,8 +978,8 @@
     <w:name w:val="KeywordTok"/>
     <w:basedOn w:val="VerbatimChar"/>
     <w:rPr>
+      <w:b/>
       <w:color w:val="007020"/>
-      <w:b/>
     </w:rPr>
   </w:style>
   <w:style w:type="character" w:customStyle="1" w:styleId="DataTypeTok">
@@ -1005,42 +1056,42 @@
     <w:name w:val="ImportTok"/>
     <w:basedOn w:val="VerbatimChar"/>
     <w:rPr>
+      <w:b/>
       <w:color w:val="008000"/>
-      <w:b/>
     </w:rPr>
   </w:style>
   <w:style w:type="character" w:customStyle="1" w:styleId="CommentTok">
     <w:name w:val="CommentTok"/>
     <w:basedOn w:val="VerbatimChar"/>
     <w:rPr>
+      <w:i/>
       <w:color w:val="60a0b0"/>
-      <w:i/>
     </w:rPr>
   </w:style>
   <w:style w:type="character" w:customStyle="1" w:styleId="DocumentationTok">
     <w:name w:val="DocumentationTok"/>
     <w:basedOn w:val="VerbatimChar"/>
     <w:rPr>
+      <w:i/>
       <w:color w:val="ba2121"/>
-      <w:i/>
     </w:rPr>
   </w:style>
   <w:style w:type="character" w:customStyle="1" w:styleId="AnnotationTok">
     <w:name w:val="AnnotationTok"/>
     <w:basedOn w:val="VerbatimChar"/>
     <w:rPr>
-      <w:color w:val="60a0b0"/>
       <w:b/>
       <w:i/>
+      <w:color w:val="60a0b0"/>
     </w:rPr>
   </w:style>
   <w:style w:type="character" w:customStyle="1" w:styleId="CommentVarTok">
     <w:name w:val="CommentVarTok"/>
     <w:basedOn w:val="VerbatimChar"/>
     <w:rPr>
-      <w:color w:val="60a0b0"/>
       <w:b/>
       <w:i/>
+      <w:color w:val="60a0b0"/>
     </w:rPr>
   </w:style>
   <w:style w:type="character" w:customStyle="1" w:styleId="OtherTok">
@@ -1068,8 +1119,8 @@
     <w:name w:val="ControlFlowTok"/>
     <w:basedOn w:val="VerbatimChar"/>
     <w:rPr>
+      <w:b/>
       <w:color w:val="007020"/>
-      <w:b/>
     </w:rPr>
   </w:style>
   <w:style w:type="character" w:customStyle="1" w:styleId="OperatorTok">
@@ -1114,34 +1165,34 @@
     <w:name w:val="InformationTok"/>
     <w:basedOn w:val="VerbatimChar"/>
     <w:rPr>
-      <w:color w:val="60a0b0"/>
       <w:b/>
       <w:i/>
+      <w:color w:val="60a0b0"/>
     </w:rPr>
   </w:style>
   <w:style w:type="character" w:customStyle="1" w:styleId="WarningTok">
     <w:name w:val="WarningTok"/>
     <w:basedOn w:val="VerbatimChar"/>
     <w:rPr>
-      <w:color w:val="60a0b0"/>
       <w:b/>
       <w:i/>
+      <w:color w:val="60a0b0"/>
     </w:rPr>
   </w:style>
   <w:style w:type="character" w:customStyle="1" w:styleId="AlertTok">
     <w:name w:val="AlertTok"/>
     <w:basedOn w:val="VerbatimChar"/>
     <w:rPr>
+      <w:b/>
       <w:color w:val="ff0000"/>
-      <w:b/>
     </w:rPr>
   </w:style>
   <w:style w:type="character" w:customStyle="1" w:styleId="ErrorTok">
     <w:name w:val="ErrorTok"/>
     <w:basedOn w:val="VerbatimChar"/>
     <w:rPr>
+      <w:b/>
       <w:color w:val="ff0000"/>
-      <w:b/>
     </w:rPr>
   </w:style>
   <w:style w:type="character" w:customStyle="1" w:styleId="NormalTok">

</xml_diff>